<commit_message>
Finalize source validation and documentation package
Updated the final project documentation for the SAU AI Ethics Toolkit.

This push adds the updated root README, refreshed media README, final validation report, and detailed security audit. The documentation now reflects the completed project structure, Cloudflare Pages deployment workflow, interview media handling, quiz/badge behavior, content validation, and static-site security posture.

Final checks confirm the site structure, content files, bibliography, credits, interviews, quiz behavior, transcript handling, and security review are ready for group review and final class presentation.
</commit_message>
<xml_diff>
--- a/docs/security_audit.docx
+++ b/docs/security_audit.docx
@@ -23,20 +23,14 @@
       </w:pPr>
       <w:r>
         <w:rPr>
-          <w:i/>
-          <w:sz w:val="22"/>
+          <w:sz w:val="21"/>
         </w:rPr>
         <w:t>Prepared for PHIL 102 Critical Thinking &amp; AI Ethics Toolkit</w:t>
+        <w:br/>
+        <w:t>Prepared by: Austin Engels | Final group-review build | May 2026</w:t>
       </w:r>
     </w:p>
-    <w:p>
-      <w:pPr>
-        <w:jc w:val="center"/>
-      </w:pPr>
-      <w:r>
-        <w:t>Prepared by: Austin Engels | Final class-review build | May 2026</w:t>
-      </w:r>
-    </w:p>
+    <w:p/>
     <w:tbl>
       <w:tblPr>
         <w:tblStyle w:val="TableGrid"/>
@@ -45,52 +39,28 @@
         <w:tblLook w:firstColumn="1" w:firstRow="1" w:lastColumn="0" w:lastRow="0" w:noHBand="0" w:noVBand="1" w:val="04A0"/>
       </w:tblPr>
       <w:tblGrid>
-        <w:gridCol w:w="5112"/>
-        <w:gridCol w:w="5112"/>
+        <w:gridCol w:w="5040"/>
+        <w:gridCol w:w="5040"/>
       </w:tblGrid>
       <w:tr>
         <w:tc>
           <w:tcPr>
-            <w:tcW w:type="dxa" w:w="5112"/>
-            <w:vAlign w:val="top"/>
-            <w:shd w:fill="003087"/>
+            <w:tcW w:type="dxa" w:w="5040"/>
+            <w:vAlign w:val="center"/>
           </w:tcPr>
           <w:p>
             <w:r>
-              <w:rPr>
-                <w:rFonts w:ascii="Calibri" w:hAnsi="Calibri"/>
-                <w:sz w:val="20"/>
-              </w:rPr>
-            </w:r>
-            <w:r>
-              <w:rPr>
-                <w:rFonts w:ascii="Calibri" w:hAnsi="Calibri"/>
-                <w:b/>
-                <w:color w:val="FFFFFF"/>
-                <w:sz w:val="20"/>
-              </w:rPr>
               <w:t>Project</w:t>
             </w:r>
           </w:p>
         </w:tc>
         <w:tc>
           <w:tcPr>
-            <w:tcW w:type="dxa" w:w="5112"/>
-            <w:vAlign w:val="top"/>
+            <w:tcW w:type="dxa" w:w="5040"/>
+            <w:vAlign w:val="center"/>
           </w:tcPr>
           <w:p>
             <w:r>
-              <w:rPr>
-                <w:rFonts w:ascii="Calibri" w:hAnsi="Calibri"/>
-                <w:sz w:val="20"/>
-              </w:rPr>
-            </w:r>
-            <w:r>
-              <w:rPr>
-                <w:rFonts w:ascii="Calibri" w:hAnsi="Calibri"/>
-                <w:b w:val="0"/>
-                <w:sz w:val="20"/>
-              </w:rPr>
               <w:t>St. Ambrose University Critical Thinking &amp; AI Ethics Toolkit</w:t>
             </w:r>
           </w:p>
@@ -99,46 +69,22 @@
       <w:tr>
         <w:tc>
           <w:tcPr>
-            <w:tcW w:type="dxa" w:w="5112"/>
-            <w:vAlign w:val="top"/>
-            <w:shd w:fill="003087"/>
+            <w:tcW w:type="dxa" w:w="5040"/>
+            <w:vAlign w:val="center"/>
           </w:tcPr>
           <w:p>
             <w:r>
-              <w:rPr>
-                <w:rFonts w:ascii="Calibri" w:hAnsi="Calibri"/>
-                <w:sz w:val="20"/>
-              </w:rPr>
-            </w:r>
-            <w:r>
-              <w:rPr>
-                <w:rFonts w:ascii="Calibri" w:hAnsi="Calibri"/>
-                <w:b/>
-                <w:color w:val="FFFFFF"/>
-                <w:sz w:val="20"/>
-              </w:rPr>
               <w:t>Repository folder</w:t>
             </w:r>
           </w:p>
         </w:tc>
         <w:tc>
           <w:tcPr>
-            <w:tcW w:type="dxa" w:w="5112"/>
-            <w:vAlign w:val="top"/>
+            <w:tcW w:type="dxa" w:w="5040"/>
+            <w:vAlign w:val="center"/>
           </w:tcPr>
           <w:p>
             <w:r>
-              <w:rPr>
-                <w:rFonts w:ascii="Calibri" w:hAnsi="Calibri"/>
-                <w:sz w:val="20"/>
-              </w:rPr>
-            </w:r>
-            <w:r>
-              <w:rPr>
-                <w:rFonts w:ascii="Calibri" w:hAnsi="Calibri"/>
-                <w:b w:val="0"/>
-                <w:sz w:val="20"/>
-              </w:rPr>
               <w:t>sau-ai-ethics-toolkit</w:t>
             </w:r>
           </w:p>
@@ -147,46 +93,22 @@
       <w:tr>
         <w:tc>
           <w:tcPr>
-            <w:tcW w:type="dxa" w:w="5112"/>
-            <w:vAlign w:val="top"/>
-            <w:shd w:fill="003087"/>
+            <w:tcW w:type="dxa" w:w="5040"/>
+            <w:vAlign w:val="center"/>
           </w:tcPr>
           <w:p>
             <w:r>
-              <w:rPr>
-                <w:rFonts w:ascii="Calibri" w:hAnsi="Calibri"/>
-                <w:sz w:val="20"/>
-              </w:rPr>
-            </w:r>
-            <w:r>
-              <w:rPr>
-                <w:rFonts w:ascii="Calibri" w:hAnsi="Calibri"/>
-                <w:b/>
-                <w:color w:val="FFFFFF"/>
-                <w:sz w:val="20"/>
-              </w:rPr>
               <w:t>Deployment model</w:t>
             </w:r>
           </w:p>
         </w:tc>
         <w:tc>
           <w:tcPr>
-            <w:tcW w:type="dxa" w:w="5112"/>
-            <w:vAlign w:val="top"/>
+            <w:tcW w:type="dxa" w:w="5040"/>
+            <w:vAlign w:val="center"/>
           </w:tcPr>
           <w:p>
             <w:r>
-              <w:rPr>
-                <w:rFonts w:ascii="Calibri" w:hAnsi="Calibri"/>
-                <w:sz w:val="20"/>
-              </w:rPr>
-            </w:r>
-            <w:r>
-              <w:rPr>
-                <w:rFonts w:ascii="Calibri" w:hAnsi="Calibri"/>
-                <w:b w:val="0"/>
-                <w:sz w:val="20"/>
-              </w:rPr>
               <w:t>Static site deployed through GitHub and Cloudflare Pages</w:t>
             </w:r>
           </w:p>
@@ -195,47 +117,23 @@
       <w:tr>
         <w:tc>
           <w:tcPr>
-            <w:tcW w:type="dxa" w:w="5112"/>
-            <w:vAlign w:val="top"/>
-            <w:shd w:fill="003087"/>
+            <w:tcW w:type="dxa" w:w="5040"/>
+            <w:vAlign w:val="center"/>
           </w:tcPr>
           <w:p>
             <w:r>
-              <w:rPr>
-                <w:rFonts w:ascii="Calibri" w:hAnsi="Calibri"/>
-                <w:sz w:val="20"/>
-              </w:rPr>
-            </w:r>
-            <w:r>
-              <w:rPr>
-                <w:rFonts w:ascii="Calibri" w:hAnsi="Calibri"/>
-                <w:b/>
-                <w:color w:val="FFFFFF"/>
-                <w:sz w:val="20"/>
-              </w:rPr>
               <w:t>Audit scope</w:t>
             </w:r>
           </w:p>
         </w:tc>
         <w:tc>
           <w:tcPr>
-            <w:tcW w:type="dxa" w:w="5112"/>
-            <w:vAlign w:val="top"/>
+            <w:tcW w:type="dxa" w:w="5040"/>
+            <w:vAlign w:val="center"/>
           </w:tcPr>
           <w:p>
             <w:r>
-              <w:rPr>
-                <w:rFonts w:ascii="Calibri" w:hAnsi="Calibri"/>
-                <w:sz w:val="20"/>
-              </w:rPr>
-            </w:r>
-            <w:r>
-              <w:rPr>
-                <w:rFonts w:ascii="Calibri" w:hAnsi="Calibri"/>
-                <w:b w:val="0"/>
-                <w:sz w:val="20"/>
-              </w:rPr>
-              <w:t>Static site code, content/data flow, media handling, security headers, documentation, and deployment-readiness posture</w:t>
+              <w:t>Static site source files, content/data flow, media handling, security headers, documentation, and deployment-readiness posture</w:t>
             </w:r>
           </w:p>
         </w:tc>
@@ -243,47 +141,23 @@
       <w:tr>
         <w:tc>
           <w:tcPr>
-            <w:tcW w:type="dxa" w:w="5112"/>
-            <w:vAlign w:val="top"/>
-            <w:shd w:fill="003087"/>
+            <w:tcW w:type="dxa" w:w="5040"/>
+            <w:vAlign w:val="center"/>
           </w:tcPr>
           <w:p>
             <w:r>
-              <w:rPr>
-                <w:rFonts w:ascii="Calibri" w:hAnsi="Calibri"/>
-                <w:sz w:val="20"/>
-              </w:rPr>
-            </w:r>
-            <w:r>
-              <w:rPr>
-                <w:rFonts w:ascii="Calibri" w:hAnsi="Calibri"/>
-                <w:b/>
-                <w:color w:val="FFFFFF"/>
-                <w:sz w:val="20"/>
-              </w:rPr>
               <w:t>Audit result</w:t>
             </w:r>
           </w:p>
         </w:tc>
         <w:tc>
           <w:tcPr>
-            <w:tcW w:type="dxa" w:w="5112"/>
-            <w:vAlign w:val="top"/>
+            <w:tcW w:type="dxa" w:w="5040"/>
+            <w:vAlign w:val="center"/>
           </w:tcPr>
           <w:p>
             <w:r>
-              <w:rPr>
-                <w:rFonts w:ascii="Calibri" w:hAnsi="Calibri"/>
-                <w:sz w:val="20"/>
-              </w:rPr>
-            </w:r>
-            <w:r>
-              <w:rPr>
-                <w:rFonts w:ascii="Calibri" w:hAnsi="Calibri"/>
-                <w:b w:val="0"/>
-                <w:sz w:val="20"/>
-              </w:rPr>
-              <w:t>Good for class-project deployment and final class review, with the limitations noted below</w:t>
+              <w:t>Good for class-project deployment and final group/class review, with limitations noted below</w:t>
             </w:r>
           </w:p>
         </w:tc>
@@ -298,13 +172,19 @@
       </w:r>
     </w:p>
     <w:p>
+      <w:pPr>
+        <w:spacing w:after="120"/>
+      </w:pPr>
       <w:r>
-        <w:t>This audit reviewed the final SAU AI Ethics Toolkit as a static, student-facing educational website. The site is designed to support classroom conversations about responsible AI use, academic integrity, privacy, data security, career readiness, and human-centered decision-making. The final build is appropriate for class review and deployment as a class project resource.</w:t>
+        <w:t>This audit reviewed the final SAU AI Ethics Toolkit as a static, student-facing educational website. The site is designed to support classroom conversations about responsible AI use, academic integrity, privacy, data security, career readiness, and human-centered decision-making. The final build is appropriate for group review, class review, and deployment as a class project resource.</w:t>
       </w:r>
     </w:p>
     <w:p>
+      <w:pPr>
+        <w:spacing w:after="120"/>
+      </w:pPr>
       <w:r>
-        <w:t>The site has a low technical attack surface because it does not use a backend, database, login system, account system, comment section, file upload flow, or stored user input. The code review did not identify common high-risk client-side patterns such as eval(), document.write, inline event handlers, raw HTML injection, or javascript: URL usage. Cloudflare Pages security headers are included through the _headers file.</w:t>
+        <w:t>The technical attack surface is low because the site does not use a backend, database, login system, account system, comment section, file upload flow, or stored user input. The reviewed source files did not contain common high-risk client-side patterns such as eval(), document.write, raw innerHTML rendering, inline event handlers, javascript: URLs, insecure external scripts, or raw HTML insertion patterns.</w:t>
       </w:r>
     </w:p>
     <w:p>
@@ -316,6 +196,9 @@
       </w:r>
     </w:p>
     <w:p>
+      <w:pPr>
+        <w:spacing w:after="120"/>
+      </w:pPr>
       <w:r>
         <w:t>Reviewed components:</w:t>
       </w:r>
@@ -325,7 +208,7 @@
         <w:pStyle w:val="ListBullet"/>
       </w:pPr>
       <w:r>
-        <w:t>index.html main page shell and site containers</w:t>
+        <w:t>index.html main page shell and root containers</w:t>
       </w:r>
     </w:p>
     <w:p>
@@ -381,10 +264,13 @@
         <w:pStyle w:val="ListBullet"/>
       </w:pPr>
       <w:r>
-        <w:t>docs directory documentation workflow, including contribution report and security audit document</w:t>
+        <w:t>docs directory documentation workflow, including contribution report, security audit, and validation report</w:t>
       </w:r>
     </w:p>
     <w:p>
+      <w:pPr>
+        <w:spacing w:after="120"/>
+      </w:pPr>
       <w:r>
         <w:t>Items outside the audit scope:</w:t>
       </w:r>
@@ -438,8 +324,11 @@
       </w:r>
     </w:p>
     <w:p>
+      <w:pPr>
+        <w:spacing w:after="120"/>
+      </w:pPr>
       <w:r>
-        <w:t>The project is a static website. The HTML page loads CSS and JavaScript from local project files. The JavaScript reads content from content/content.json and renders sections, cards, interviews, transcripts, quiz questions, and credits in the browser. The site does not collect, store, or submit visitor data.</w:t>
+        <w:t>The project is a static website. The HTML page loads local CSS and JavaScript. The JavaScript reads content from content/content.json and renders sections, cards, interviews, transcripts, quiz questions, bibliography entries, and credits in the browser. The site does not collect, store, or submit visitor data.</w:t>
       </w:r>
     </w:p>
     <w:p>
@@ -455,7 +344,7 @@
         <w:pStyle w:val="ListBullet"/>
       </w:pPr>
       <w:r>
-        <w:t>Rendering method: DOM creation with document.createElement and textContent-style assignment rather than raw HTML injection</w:t>
+        <w:t>Rendering method: DOM creation with textContent-style assignment rather than raw HTML injection</w:t>
       </w:r>
     </w:p>
     <w:p>
@@ -463,7 +352,7 @@
         <w:pStyle w:val="ListBullet"/>
       </w:pPr>
       <w:r>
-        <w:t>Media model: YouTube-nocookie embeds for large interview videos and one local audio file for Dr. Samantha Dunn</w:t>
+        <w:t>Media model: YouTube/YouTube-nocookie embeds for larger interview videos and one local audio file for Dr. Samantha Dunn</w:t>
       </w:r>
     </w:p>
     <w:p>
@@ -498,79 +387,37 @@
         <w:tblLook w:firstColumn="1" w:firstRow="1" w:lastColumn="0" w:lastRow="0" w:noHBand="0" w:noVBand="1" w:val="04A0"/>
       </w:tblPr>
       <w:tblGrid>
-        <w:gridCol w:w="3408"/>
-        <w:gridCol w:w="3408"/>
-        <w:gridCol w:w="3408"/>
+        <w:gridCol w:w="3360"/>
+        <w:gridCol w:w="3360"/>
+        <w:gridCol w:w="3360"/>
       </w:tblGrid>
       <w:tr>
         <w:tc>
           <w:tcPr>
-            <w:tcW w:type="dxa" w:w="3408"/>
-            <w:vAlign w:val="top"/>
-            <w:shd w:fill="003087"/>
+            <w:tcW w:type="dxa" w:w="3360"/>
           </w:tcPr>
           <w:p>
             <w:r>
-              <w:rPr>
-                <w:rFonts w:ascii="Calibri" w:hAnsi="Calibri"/>
-                <w:sz w:val="20"/>
-              </w:rPr>
-            </w:r>
-            <w:r>
-              <w:rPr>
-                <w:rFonts w:ascii="Calibri" w:hAnsi="Calibri"/>
-                <w:b/>
-                <w:color w:val="FFFFFF"/>
-                <w:sz w:val="20"/>
-              </w:rPr>
               <w:t>Control</w:t>
             </w:r>
           </w:p>
         </w:tc>
         <w:tc>
           <w:tcPr>
-            <w:tcW w:type="dxa" w:w="3408"/>
-            <w:vAlign w:val="top"/>
-            <w:shd w:fill="003087"/>
+            <w:tcW w:type="dxa" w:w="3360"/>
           </w:tcPr>
           <w:p>
             <w:r>
-              <w:rPr>
-                <w:rFonts w:ascii="Calibri" w:hAnsi="Calibri"/>
-                <w:sz w:val="20"/>
-              </w:rPr>
-            </w:r>
-            <w:r>
-              <w:rPr>
-                <w:rFonts w:ascii="Calibri" w:hAnsi="Calibri"/>
-                <w:b/>
-                <w:color w:val="FFFFFF"/>
-                <w:sz w:val="20"/>
-              </w:rPr>
               <w:t>Finding</w:t>
             </w:r>
           </w:p>
         </w:tc>
         <w:tc>
           <w:tcPr>
-            <w:tcW w:type="dxa" w:w="3408"/>
-            <w:vAlign w:val="top"/>
-            <w:shd w:fill="003087"/>
+            <w:tcW w:type="dxa" w:w="3360"/>
           </w:tcPr>
           <w:p>
             <w:r>
-              <w:rPr>
-                <w:rFonts w:ascii="Calibri" w:hAnsi="Calibri"/>
-                <w:sz w:val="20"/>
-              </w:rPr>
-            </w:r>
-            <w:r>
-              <w:rPr>
-                <w:rFonts w:ascii="Calibri" w:hAnsi="Calibri"/>
-                <w:b/>
-                <w:color w:val="FFFFFF"/>
-                <w:sz w:val="20"/>
-              </w:rPr>
               <w:t>Status</w:t>
             </w:r>
           </w:p>
@@ -579,66 +426,30 @@
       <w:tr>
         <w:tc>
           <w:tcPr>
-            <w:tcW w:type="dxa" w:w="3408"/>
-            <w:vAlign w:val="top"/>
+            <w:tcW w:type="dxa" w:w="3360"/>
           </w:tcPr>
           <w:p>
             <w:r>
-              <w:rPr>
-                <w:rFonts w:ascii="Calibri" w:hAnsi="Calibri"/>
-                <w:sz w:val="20"/>
-              </w:rPr>
-            </w:r>
-            <w:r>
-              <w:rPr>
-                <w:rFonts w:ascii="Calibri" w:hAnsi="Calibri"/>
-                <w:b w:val="0"/>
-                <w:sz w:val="20"/>
-              </w:rPr>
               <w:t>Static deployment model</w:t>
             </w:r>
           </w:p>
         </w:tc>
         <w:tc>
           <w:tcPr>
-            <w:tcW w:type="dxa" w:w="3408"/>
-            <w:vAlign w:val="top"/>
+            <w:tcW w:type="dxa" w:w="3360"/>
           </w:tcPr>
           <w:p>
             <w:r>
-              <w:rPr>
-                <w:rFonts w:ascii="Calibri" w:hAnsi="Calibri"/>
-                <w:sz w:val="20"/>
-              </w:rPr>
-            </w:r>
-            <w:r>
-              <w:rPr>
-                <w:rFonts w:ascii="Calibri" w:hAnsi="Calibri"/>
-                <w:b w:val="0"/>
-                <w:sz w:val="20"/>
-              </w:rPr>
               <w:t>No custom backend, database, login, account system, or stored user input.</w:t>
             </w:r>
           </w:p>
         </w:tc>
         <w:tc>
           <w:tcPr>
-            <w:tcW w:type="dxa" w:w="3408"/>
-            <w:vAlign w:val="top"/>
+            <w:tcW w:type="dxa" w:w="3360"/>
           </w:tcPr>
           <w:p>
             <w:r>
-              <w:rPr>
-                <w:rFonts w:ascii="Calibri" w:hAnsi="Calibri"/>
-                <w:sz w:val="20"/>
-              </w:rPr>
-            </w:r>
-            <w:r>
-              <w:rPr>
-                <w:rFonts w:ascii="Calibri" w:hAnsi="Calibri"/>
-                <w:b w:val="0"/>
-                <w:sz w:val="20"/>
-              </w:rPr>
               <w:t>Pass</w:t>
             </w:r>
           </w:p>
@@ -647,66 +458,30 @@
       <w:tr>
         <w:tc>
           <w:tcPr>
-            <w:tcW w:type="dxa" w:w="3408"/>
-            <w:vAlign w:val="top"/>
+            <w:tcW w:type="dxa" w:w="3360"/>
           </w:tcPr>
           <w:p>
             <w:r>
-              <w:rPr>
-                <w:rFonts w:ascii="Calibri" w:hAnsi="Calibri"/>
-                <w:sz w:val="20"/>
-              </w:rPr>
-            </w:r>
-            <w:r>
-              <w:rPr>
-                <w:rFonts w:ascii="Calibri" w:hAnsi="Calibri"/>
-                <w:b w:val="0"/>
-                <w:sz w:val="20"/>
-              </w:rPr>
               <w:t>Content Security Policy</w:t>
             </w:r>
           </w:p>
         </w:tc>
         <w:tc>
           <w:tcPr>
-            <w:tcW w:type="dxa" w:w="3408"/>
-            <w:vAlign w:val="top"/>
+            <w:tcW w:type="dxa" w:w="3360"/>
           </w:tcPr>
           <w:p>
             <w:r>
-              <w:rPr>
-                <w:rFonts w:ascii="Calibri" w:hAnsi="Calibri"/>
-                <w:sz w:val="20"/>
-              </w:rPr>
-            </w:r>
-            <w:r>
-              <w:rPr>
-                <w:rFonts w:ascii="Calibri" w:hAnsi="Calibri"/>
-                <w:b w:val="0"/>
-                <w:sz w:val="20"/>
-              </w:rPr>
-              <w:t>The _headers file defines a CSP that restricts scripts and styles to self, limits frames to YouTube/YouTube-nocookie, blocks objects, and restricts form actions.</w:t>
+              <w:t>The _headers file should restrict scripts/styles to self, limit frames to YouTube/YouTube-nocookie, block objects, and restrict form actions.</w:t>
             </w:r>
           </w:p>
         </w:tc>
         <w:tc>
           <w:tcPr>
-            <w:tcW w:type="dxa" w:w="3408"/>
-            <w:vAlign w:val="top"/>
+            <w:tcW w:type="dxa" w:w="3360"/>
           </w:tcPr>
           <w:p>
             <w:r>
-              <w:rPr>
-                <w:rFonts w:ascii="Calibri" w:hAnsi="Calibri"/>
-                <w:sz w:val="20"/>
-              </w:rPr>
-            </w:r>
-            <w:r>
-              <w:rPr>
-                <w:rFonts w:ascii="Calibri" w:hAnsi="Calibri"/>
-                <w:b w:val="0"/>
-                <w:sz w:val="20"/>
-              </w:rPr>
               <w:t>Pass</w:t>
             </w:r>
           </w:p>
@@ -715,66 +490,30 @@
       <w:tr>
         <w:tc>
           <w:tcPr>
-            <w:tcW w:type="dxa" w:w="3408"/>
-            <w:vAlign w:val="top"/>
+            <w:tcW w:type="dxa" w:w="3360"/>
           </w:tcPr>
           <w:p>
             <w:r>
-              <w:rPr>
-                <w:rFonts w:ascii="Calibri" w:hAnsi="Calibri"/>
-                <w:sz w:val="20"/>
-              </w:rPr>
-            </w:r>
-            <w:r>
-              <w:rPr>
-                <w:rFonts w:ascii="Calibri" w:hAnsi="Calibri"/>
-                <w:b w:val="0"/>
-                <w:sz w:val="20"/>
-              </w:rPr>
               <w:t>X-Content-Type-Options</w:t>
             </w:r>
           </w:p>
         </w:tc>
         <w:tc>
           <w:tcPr>
-            <w:tcW w:type="dxa" w:w="3408"/>
-            <w:vAlign w:val="top"/>
+            <w:tcW w:type="dxa" w:w="3360"/>
           </w:tcPr>
           <w:p>
             <w:r>
-              <w:rPr>
-                <w:rFonts w:ascii="Calibri" w:hAnsi="Calibri"/>
-                <w:sz w:val="20"/>
-              </w:rPr>
-            </w:r>
-            <w:r>
-              <w:rPr>
-                <w:rFonts w:ascii="Calibri" w:hAnsi="Calibri"/>
-                <w:b w:val="0"/>
-                <w:sz w:val="20"/>
-              </w:rPr>
-              <w:t>nosniff is present to reduce MIME-sniffing risk.</w:t>
+              <w:t>nosniff should remain present to reduce MIME-sniffing risk.</w:t>
             </w:r>
           </w:p>
         </w:tc>
         <w:tc>
           <w:tcPr>
-            <w:tcW w:type="dxa" w:w="3408"/>
-            <w:vAlign w:val="top"/>
+            <w:tcW w:type="dxa" w:w="3360"/>
           </w:tcPr>
           <w:p>
             <w:r>
-              <w:rPr>
-                <w:rFonts w:ascii="Calibri" w:hAnsi="Calibri"/>
-                <w:sz w:val="20"/>
-              </w:rPr>
-            </w:r>
-            <w:r>
-              <w:rPr>
-                <w:rFonts w:ascii="Calibri" w:hAnsi="Calibri"/>
-                <w:b w:val="0"/>
-                <w:sz w:val="20"/>
-              </w:rPr>
               <w:t>Pass</w:t>
             </w:r>
           </w:p>
@@ -783,66 +522,30 @@
       <w:tr>
         <w:tc>
           <w:tcPr>
-            <w:tcW w:type="dxa" w:w="3408"/>
-            <w:vAlign w:val="top"/>
+            <w:tcW w:type="dxa" w:w="3360"/>
           </w:tcPr>
           <w:p>
             <w:r>
-              <w:rPr>
-                <w:rFonts w:ascii="Calibri" w:hAnsi="Calibri"/>
-                <w:sz w:val="20"/>
-              </w:rPr>
-            </w:r>
-            <w:r>
-              <w:rPr>
-                <w:rFonts w:ascii="Calibri" w:hAnsi="Calibri"/>
-                <w:b w:val="0"/>
-                <w:sz w:val="20"/>
-              </w:rPr>
               <w:t>Referrer-Policy</w:t>
             </w:r>
           </w:p>
         </w:tc>
         <w:tc>
           <w:tcPr>
-            <w:tcW w:type="dxa" w:w="3408"/>
-            <w:vAlign w:val="top"/>
+            <w:tcW w:type="dxa" w:w="3360"/>
           </w:tcPr>
           <w:p>
             <w:r>
-              <w:rPr>
-                <w:rFonts w:ascii="Calibri" w:hAnsi="Calibri"/>
-                <w:sz w:val="20"/>
-              </w:rPr>
-            </w:r>
-            <w:r>
-              <w:rPr>
-                <w:rFonts w:ascii="Calibri" w:hAnsi="Calibri"/>
-                <w:b w:val="0"/>
-                <w:sz w:val="20"/>
-              </w:rPr>
-              <w:t>strict-origin-when-cross-origin is present to reduce unnecessary referrer leakage.</w:t>
+              <w:t>strict-origin-when-cross-origin should remain present to reduce unnecessary referrer leakage.</w:t>
             </w:r>
           </w:p>
         </w:tc>
         <w:tc>
           <w:tcPr>
-            <w:tcW w:type="dxa" w:w="3408"/>
-            <w:vAlign w:val="top"/>
+            <w:tcW w:type="dxa" w:w="3360"/>
           </w:tcPr>
           <w:p>
             <w:r>
-              <w:rPr>
-                <w:rFonts w:ascii="Calibri" w:hAnsi="Calibri"/>
-                <w:sz w:val="20"/>
-              </w:rPr>
-            </w:r>
-            <w:r>
-              <w:rPr>
-                <w:rFonts w:ascii="Calibri" w:hAnsi="Calibri"/>
-                <w:b w:val="0"/>
-                <w:sz w:val="20"/>
-              </w:rPr>
               <w:t>Pass</w:t>
             </w:r>
           </w:p>
@@ -851,66 +554,30 @@
       <w:tr>
         <w:tc>
           <w:tcPr>
-            <w:tcW w:type="dxa" w:w="3408"/>
-            <w:vAlign w:val="top"/>
+            <w:tcW w:type="dxa" w:w="3360"/>
           </w:tcPr>
           <w:p>
             <w:r>
-              <w:rPr>
-                <w:rFonts w:ascii="Calibri" w:hAnsi="Calibri"/>
-                <w:sz w:val="20"/>
-              </w:rPr>
-            </w:r>
-            <w:r>
-              <w:rPr>
-                <w:rFonts w:ascii="Calibri" w:hAnsi="Calibri"/>
-                <w:b w:val="0"/>
-                <w:sz w:val="20"/>
-              </w:rPr>
               <w:t>X-Frame-Options</w:t>
             </w:r>
           </w:p>
         </w:tc>
         <w:tc>
           <w:tcPr>
-            <w:tcW w:type="dxa" w:w="3408"/>
-            <w:vAlign w:val="top"/>
+            <w:tcW w:type="dxa" w:w="3360"/>
           </w:tcPr>
           <w:p>
             <w:r>
-              <w:rPr>
-                <w:rFonts w:ascii="Calibri" w:hAnsi="Calibri"/>
-                <w:sz w:val="20"/>
-              </w:rPr>
-            </w:r>
-            <w:r>
-              <w:rPr>
-                <w:rFonts w:ascii="Calibri" w:hAnsi="Calibri"/>
-                <w:b w:val="0"/>
-                <w:sz w:val="20"/>
-              </w:rPr>
-              <w:t>SAMEORIGIN is present as a clickjacking defense for the site itself.</w:t>
+              <w:t>SAMEORIGIN should remain present as a clickjacking defense for the site itself.</w:t>
             </w:r>
           </w:p>
         </w:tc>
         <w:tc>
           <w:tcPr>
-            <w:tcW w:type="dxa" w:w="3408"/>
-            <w:vAlign w:val="top"/>
+            <w:tcW w:type="dxa" w:w="3360"/>
           </w:tcPr>
           <w:p>
             <w:r>
-              <w:rPr>
-                <w:rFonts w:ascii="Calibri" w:hAnsi="Calibri"/>
-                <w:sz w:val="20"/>
-              </w:rPr>
-            </w:r>
-            <w:r>
-              <w:rPr>
-                <w:rFonts w:ascii="Calibri" w:hAnsi="Calibri"/>
-                <w:b w:val="0"/>
-                <w:sz w:val="20"/>
-              </w:rPr>
               <w:t>Pass</w:t>
             </w:r>
           </w:p>
@@ -919,66 +586,30 @@
       <w:tr>
         <w:tc>
           <w:tcPr>
-            <w:tcW w:type="dxa" w:w="3408"/>
-            <w:vAlign w:val="top"/>
+            <w:tcW w:type="dxa" w:w="3360"/>
           </w:tcPr>
           <w:p>
             <w:r>
-              <w:rPr>
-                <w:rFonts w:ascii="Calibri" w:hAnsi="Calibri"/>
-                <w:sz w:val="20"/>
-              </w:rPr>
-            </w:r>
-            <w:r>
-              <w:rPr>
-                <w:rFonts w:ascii="Calibri" w:hAnsi="Calibri"/>
-                <w:b w:val="0"/>
-                <w:sz w:val="20"/>
-              </w:rPr>
               <w:t>Safe dynamic rendering</w:t>
             </w:r>
           </w:p>
         </w:tc>
         <w:tc>
           <w:tcPr>
-            <w:tcW w:type="dxa" w:w="3408"/>
-            <w:vAlign w:val="top"/>
+            <w:tcW w:type="dxa" w:w="3360"/>
           </w:tcPr>
           <w:p>
             <w:r>
-              <w:rPr>
-                <w:rFonts w:ascii="Calibri" w:hAnsi="Calibri"/>
-                <w:sz w:val="20"/>
-              </w:rPr>
-            </w:r>
-            <w:r>
-              <w:rPr>
-                <w:rFonts w:ascii="Calibri" w:hAnsi="Calibri"/>
-                <w:b w:val="0"/>
-                <w:sz w:val="20"/>
-              </w:rPr>
-              <w:t>The JavaScript renders content using DOM methods and textContent-style behavior rather than injecting untrusted raw HTML.</w:t>
+              <w:t>JavaScript renders content using DOM methods and textContent-style behavior rather than injecting untrusted raw HTML.</w:t>
             </w:r>
           </w:p>
         </w:tc>
         <w:tc>
           <w:tcPr>
-            <w:tcW w:type="dxa" w:w="3408"/>
-            <w:vAlign w:val="top"/>
+            <w:tcW w:type="dxa" w:w="3360"/>
           </w:tcPr>
           <w:p>
             <w:r>
-              <w:rPr>
-                <w:rFonts w:ascii="Calibri" w:hAnsi="Calibri"/>
-                <w:sz w:val="20"/>
-              </w:rPr>
-            </w:r>
-            <w:r>
-              <w:rPr>
-                <w:rFonts w:ascii="Calibri" w:hAnsi="Calibri"/>
-                <w:b w:val="0"/>
-                <w:sz w:val="20"/>
-              </w:rPr>
               <w:t>Pass</w:t>
             </w:r>
           </w:p>
@@ -987,66 +618,30 @@
       <w:tr>
         <w:tc>
           <w:tcPr>
-            <w:tcW w:type="dxa" w:w="3408"/>
-            <w:vAlign w:val="top"/>
+            <w:tcW w:type="dxa" w:w="3360"/>
           </w:tcPr>
           <w:p>
             <w:r>
-              <w:rPr>
-                <w:rFonts w:ascii="Calibri" w:hAnsi="Calibri"/>
-                <w:sz w:val="20"/>
-              </w:rPr>
-            </w:r>
-            <w:r>
-              <w:rPr>
-                <w:rFonts w:ascii="Calibri" w:hAnsi="Calibri"/>
-                <w:b w:val="0"/>
-                <w:sz w:val="20"/>
-              </w:rPr>
-              <w:t>No exposed secrets</w:t>
+              <w:t>External media validation</w:t>
             </w:r>
           </w:p>
         </w:tc>
         <w:tc>
           <w:tcPr>
-            <w:tcW w:type="dxa" w:w="3408"/>
-            <w:vAlign w:val="top"/>
+            <w:tcW w:type="dxa" w:w="3360"/>
           </w:tcPr>
           <w:p>
             <w:r>
-              <w:rPr>
-                <w:rFonts w:ascii="Calibri" w:hAnsi="Calibri"/>
-                <w:sz w:val="20"/>
-              </w:rPr>
-            </w:r>
-            <w:r>
-              <w:rPr>
-                <w:rFonts w:ascii="Calibri" w:hAnsi="Calibri"/>
-                <w:b w:val="0"/>
-                <w:sz w:val="20"/>
-              </w:rPr>
-              <w:t>No API keys, passwords, tokens, or private credentials are required or exposed in the static project.</w:t>
+              <w:t>External watch links are limited to HTTPS YouTube-domain URLs.</w:t>
             </w:r>
           </w:p>
         </w:tc>
         <w:tc>
           <w:tcPr>
-            <w:tcW w:type="dxa" w:w="3408"/>
-            <w:vAlign w:val="top"/>
+            <w:tcW w:type="dxa" w:w="3360"/>
           </w:tcPr>
           <w:p>
             <w:r>
-              <w:rPr>
-                <w:rFonts w:ascii="Calibri" w:hAnsi="Calibri"/>
-                <w:sz w:val="20"/>
-              </w:rPr>
-            </w:r>
-            <w:r>
-              <w:rPr>
-                <w:rFonts w:ascii="Calibri" w:hAnsi="Calibri"/>
-                <w:b w:val="0"/>
-                <w:sz w:val="20"/>
-              </w:rPr>
               <w:t>Pass</w:t>
             </w:r>
           </w:p>
@@ -1055,66 +650,30 @@
       <w:tr>
         <w:tc>
           <w:tcPr>
-            <w:tcW w:type="dxa" w:w="3408"/>
-            <w:vAlign w:val="top"/>
+            <w:tcW w:type="dxa" w:w="3360"/>
           </w:tcPr>
           <w:p>
             <w:r>
-              <w:rPr>
-                <w:rFonts w:ascii="Calibri" w:hAnsi="Calibri"/>
-                <w:sz w:val="20"/>
-              </w:rPr>
-            </w:r>
-            <w:r>
-              <w:rPr>
-                <w:rFonts w:ascii="Calibri" w:hAnsi="Calibri"/>
-                <w:b w:val="0"/>
-                <w:sz w:val="20"/>
-              </w:rPr>
-              <w:t>No public form endpoint</w:t>
+              <w:t>No exposed secrets</w:t>
             </w:r>
           </w:p>
         </w:tc>
         <w:tc>
           <w:tcPr>
-            <w:tcW w:type="dxa" w:w="3408"/>
-            <w:vAlign w:val="top"/>
+            <w:tcW w:type="dxa" w:w="3360"/>
           </w:tcPr>
           <w:p>
             <w:r>
-              <w:rPr>
-                <w:rFonts w:ascii="Calibri" w:hAnsi="Calibri"/>
-                <w:sz w:val="20"/>
-              </w:rPr>
-            </w:r>
-            <w:r>
-              <w:rPr>
-                <w:rFonts w:ascii="Calibri" w:hAnsi="Calibri"/>
-                <w:b w:val="0"/>
-                <w:sz w:val="20"/>
-              </w:rPr>
-              <w:t>The site has no data-submission form, so there is no server-side input handling or database storage risk.</w:t>
+              <w:t>No API keys, passwords, tokens, or private credentials are required or exposed in the static project.</w:t>
             </w:r>
           </w:p>
         </w:tc>
         <w:tc>
           <w:tcPr>
-            <w:tcW w:type="dxa" w:w="3408"/>
-            <w:vAlign w:val="top"/>
+            <w:tcW w:type="dxa" w:w="3360"/>
           </w:tcPr>
           <w:p>
             <w:r>
-              <w:rPr>
-                <w:rFonts w:ascii="Calibri" w:hAnsi="Calibri"/>
-                <w:sz w:val="20"/>
-              </w:rPr>
-            </w:r>
-            <w:r>
-              <w:rPr>
-                <w:rFonts w:ascii="Calibri" w:hAnsi="Calibri"/>
-                <w:b w:val="0"/>
-                <w:sz w:val="20"/>
-              </w:rPr>
               <w:t>Pass</w:t>
             </w:r>
           </w:p>
@@ -1130,8 +689,11 @@
       </w:r>
     </w:p>
     <w:p>
+      <w:pPr>
+        <w:spacing w:after="120"/>
+      </w:pPr>
       <w:r>
-        <w:t>The final codebase was checked for common client-side web security risks. The following high-risk patterns were not present in the reviewed site files:</w:t>
+        <w:t>The final source files were checked for common client-side web security risks. The following high-risk patterns were not present in the reviewed files:</w:t>
       </w:r>
     </w:p>
     <w:p>
@@ -1155,7 +717,7 @@
         <w:pStyle w:val="ListBullet"/>
       </w:pPr>
       <w:r>
-        <w:t>raw HTML injection pattern</w:t>
+        <w:t>raw innerHTML rendering pattern</w:t>
       </w:r>
     </w:p>
     <w:p>
@@ -1187,12 +749,23 @@
         <w:pStyle w:val="ListBullet"/>
       </w:pPr>
       <w:r>
-        <w:t>hardcoded secrets or API keys</w:t>
+        <w:t>hardcoded secrets, API keys, or tokens</w:t>
       </w:r>
     </w:p>
     <w:p>
+      <w:pPr>
+        <w:pStyle w:val="ListBullet"/>
+      </w:pPr>
       <w:r>
-        <w:t>The quiz and interview transcript features use JavaScript to render content dynamically, but the rendering approach is structured around DOM creation and plain text assignment. This is safer than inserting raw HTML strings into the page. The site also uses a whitelist approach for YouTube embed URLs.</w:t>
+        <w:t>raw HTML insertion patterns such as insertAdjacentHTML</w:t>
+      </w:r>
+    </w:p>
+    <w:p>
+      <w:pPr>
+        <w:spacing w:after="120"/>
+      </w:pPr>
+      <w:r>
+        <w:t>The quiz and transcript features use JavaScript to render content dynamically, but the rendering approach uses structured DOM creation and plain text assignment. This is safer than inserting raw HTML strings into the page.</w:t>
       </w:r>
     </w:p>
     <w:p>
@@ -1207,108 +780,51 @@
       <w:tblPr>
         <w:tblStyle w:val="TableGrid"/>
         <w:tblW w:type="auto" w:w="0"/>
-        <w:jc w:val="center"/>
         <w:tblLook w:firstColumn="1" w:firstRow="1" w:lastColumn="0" w:lastRow="0" w:noHBand="0" w:noVBand="1" w:val="04A0"/>
       </w:tblPr>
       <w:tblGrid>
-        <w:gridCol w:w="2556"/>
-        <w:gridCol w:w="2556"/>
-        <w:gridCol w:w="2556"/>
-        <w:gridCol w:w="2556"/>
+        <w:gridCol w:w="2520"/>
+        <w:gridCol w:w="2520"/>
+        <w:gridCol w:w="2520"/>
+        <w:gridCol w:w="2520"/>
       </w:tblGrid>
       <w:tr>
         <w:tc>
           <w:tcPr>
-            <w:tcW w:type="dxa" w:w="2556"/>
-            <w:vAlign w:val="top"/>
-            <w:shd w:fill="003087"/>
+            <w:tcW w:type="dxa" w:w="2520"/>
           </w:tcPr>
           <w:p>
             <w:r>
-              <w:rPr>
-                <w:rFonts w:ascii="Calibri" w:hAnsi="Calibri"/>
-                <w:sz w:val="20"/>
-              </w:rPr>
-            </w:r>
-            <w:r>
-              <w:rPr>
-                <w:rFonts w:ascii="Calibri" w:hAnsi="Calibri"/>
-                <w:b/>
-                <w:color w:val="FFFFFF"/>
-                <w:sz w:val="20"/>
-              </w:rPr>
               <w:t>Risk Area</w:t>
             </w:r>
           </w:p>
         </w:tc>
         <w:tc>
           <w:tcPr>
-            <w:tcW w:type="dxa" w:w="2556"/>
-            <w:vAlign w:val="top"/>
-            <w:shd w:fill="003087"/>
+            <w:tcW w:type="dxa" w:w="2520"/>
           </w:tcPr>
           <w:p>
             <w:r>
-              <w:rPr>
-                <w:rFonts w:ascii="Calibri" w:hAnsi="Calibri"/>
-                <w:sz w:val="20"/>
-              </w:rPr>
-            </w:r>
-            <w:r>
-              <w:rPr>
-                <w:rFonts w:ascii="Calibri" w:hAnsi="Calibri"/>
-                <w:b/>
-                <w:color w:val="FFFFFF"/>
-                <w:sz w:val="20"/>
-              </w:rPr>
-              <w:t>Risk Level</w:t>
+              <w:t>Level</w:t>
             </w:r>
           </w:p>
         </w:tc>
         <w:tc>
           <w:tcPr>
-            <w:tcW w:type="dxa" w:w="2556"/>
-            <w:vAlign w:val="top"/>
-            <w:shd w:fill="003087"/>
+            <w:tcW w:type="dxa" w:w="2520"/>
           </w:tcPr>
           <w:p>
             <w:r>
-              <w:rPr>
-                <w:rFonts w:ascii="Calibri" w:hAnsi="Calibri"/>
-                <w:sz w:val="20"/>
-              </w:rPr>
-            </w:r>
-            <w:r>
-              <w:rPr>
-                <w:rFonts w:ascii="Calibri" w:hAnsi="Calibri"/>
-                <w:b/>
-                <w:color w:val="FFFFFF"/>
-                <w:sz w:val="20"/>
-              </w:rPr>
               <w:t>Finding</w:t>
             </w:r>
           </w:p>
         </w:tc>
         <w:tc>
           <w:tcPr>
-            <w:tcW w:type="dxa" w:w="2556"/>
-            <w:vAlign w:val="top"/>
-            <w:shd w:fill="003087"/>
+            <w:tcW w:type="dxa" w:w="2520"/>
           </w:tcPr>
           <w:p>
             <w:r>
-              <w:rPr>
-                <w:rFonts w:ascii="Calibri" w:hAnsi="Calibri"/>
-                <w:sz w:val="20"/>
-              </w:rPr>
-            </w:r>
-            <w:r>
-              <w:rPr>
-                <w:rFonts w:ascii="Calibri" w:hAnsi="Calibri"/>
-                <w:b/>
-                <w:color w:val="FFFFFF"/>
-                <w:sz w:val="20"/>
-              </w:rPr>
               <w:t>Mitigation / Note</w:t>
             </w:r>
           </w:p>
@@ -1317,89 +833,41 @@
       <w:tr>
         <w:tc>
           <w:tcPr>
-            <w:tcW w:type="dxa" w:w="2556"/>
-            <w:vAlign w:val="top"/>
+            <w:tcW w:type="dxa" w:w="2520"/>
           </w:tcPr>
           <w:p>
             <w:r>
-              <w:rPr>
-                <w:rFonts w:ascii="Calibri" w:hAnsi="Calibri"/>
-                <w:sz w:val="20"/>
-              </w:rPr>
-            </w:r>
-            <w:r>
-              <w:rPr>
-                <w:rFonts w:ascii="Calibri" w:hAnsi="Calibri"/>
-                <w:b w:val="0"/>
-                <w:sz w:val="20"/>
-              </w:rPr>
               <w:t>Cross-site scripting</w:t>
             </w:r>
           </w:p>
         </w:tc>
         <w:tc>
           <w:tcPr>
-            <w:tcW w:type="dxa" w:w="2556"/>
-            <w:vAlign w:val="top"/>
+            <w:tcW w:type="dxa" w:w="2520"/>
           </w:tcPr>
           <w:p>
             <w:r>
-              <w:rPr>
-                <w:rFonts w:ascii="Calibri" w:hAnsi="Calibri"/>
-                <w:sz w:val="20"/>
-              </w:rPr>
-            </w:r>
-            <w:r>
-              <w:rPr>
-                <w:rFonts w:ascii="Calibri" w:hAnsi="Calibri"/>
-                <w:b w:val="0"/>
-                <w:sz w:val="20"/>
-              </w:rPr>
               <w:t>Low</w:t>
             </w:r>
           </w:p>
         </w:tc>
         <w:tc>
           <w:tcPr>
-            <w:tcW w:type="dxa" w:w="2556"/>
-            <w:vAlign w:val="top"/>
+            <w:tcW w:type="dxa" w:w="2520"/>
           </w:tcPr>
           <w:p>
             <w:r>
-              <w:rPr>
-                <w:rFonts w:ascii="Calibri" w:hAnsi="Calibri"/>
-                <w:sz w:val="20"/>
-              </w:rPr>
-            </w:r>
-            <w:r>
-              <w:rPr>
-                <w:rFonts w:ascii="Calibri" w:hAnsi="Calibri"/>
-                <w:b w:val="0"/>
-                <w:sz w:val="20"/>
-              </w:rPr>
               <w:t>No raw HTML injection pattern or inline event handlers were identified.</w:t>
             </w:r>
           </w:p>
         </w:tc>
         <w:tc>
           <w:tcPr>
-            <w:tcW w:type="dxa" w:w="2556"/>
-            <w:vAlign w:val="top"/>
+            <w:tcW w:type="dxa" w:w="2520"/>
           </w:tcPr>
           <w:p>
             <w:r>
-              <w:rPr>
-                <w:rFonts w:ascii="Calibri" w:hAnsi="Calibri"/>
-                <w:sz w:val="20"/>
-              </w:rPr>
-            </w:r>
-            <w:r>
-              <w:rPr>
-                <w:rFonts w:ascii="Calibri" w:hAnsi="Calibri"/>
-                <w:b w:val="0"/>
-                <w:sz w:val="20"/>
-              </w:rPr>
-              <w:t>Continue using safe DOM/text rendering when editing JavaScript.</w:t>
+              <w:t>Continue using DOM/text rendering when editing JavaScript.</w:t>
             </w:r>
           </w:p>
         </w:tc>
@@ -1407,178 +875,40 @@
       <w:tr>
         <w:tc>
           <w:tcPr>
-            <w:tcW w:type="dxa" w:w="2556"/>
-            <w:vAlign w:val="top"/>
+            <w:tcW w:type="dxa" w:w="2520"/>
           </w:tcPr>
           <w:p>
             <w:r>
-              <w:rPr>
-                <w:rFonts w:ascii="Calibri" w:hAnsi="Calibri"/>
-                <w:sz w:val="20"/>
-              </w:rPr>
-            </w:r>
-            <w:r>
-              <w:rPr>
-                <w:rFonts w:ascii="Calibri" w:hAnsi="Calibri"/>
-                <w:b w:val="0"/>
-                <w:sz w:val="20"/>
-              </w:rPr>
               <w:t>Clickjacking</w:t>
             </w:r>
           </w:p>
         </w:tc>
         <w:tc>
           <w:tcPr>
-            <w:tcW w:type="dxa" w:w="2556"/>
-            <w:vAlign w:val="top"/>
+            <w:tcW w:type="dxa" w:w="2520"/>
           </w:tcPr>
           <w:p>
             <w:r>
-              <w:rPr>
-                <w:rFonts w:ascii="Calibri" w:hAnsi="Calibri"/>
-                <w:sz w:val="20"/>
-              </w:rPr>
-            </w:r>
-            <w:r>
-              <w:rPr>
-                <w:rFonts w:ascii="Calibri" w:hAnsi="Calibri"/>
-                <w:b w:val="0"/>
-                <w:sz w:val="20"/>
-              </w:rPr>
               <w:t>Low</w:t>
             </w:r>
           </w:p>
         </w:tc>
         <w:tc>
           <w:tcPr>
-            <w:tcW w:type="dxa" w:w="2556"/>
-            <w:vAlign w:val="top"/>
+            <w:tcW w:type="dxa" w:w="2520"/>
           </w:tcPr>
           <w:p>
             <w:r>
-              <w:rPr>
-                <w:rFonts w:ascii="Calibri" w:hAnsi="Calibri"/>
-                <w:sz w:val="20"/>
-              </w:rPr>
-            </w:r>
-            <w:r>
-              <w:rPr>
-                <w:rFonts w:ascii="Calibri" w:hAnsi="Calibri"/>
-                <w:b w:val="0"/>
-                <w:sz w:val="20"/>
-              </w:rPr>
-              <w:t>X-Frame-Options: SAMEORIGIN is present.</w:t>
+              <w:t>X-Frame-Options: SAMEORIGIN should remain present in _headers.</w:t>
             </w:r>
           </w:p>
         </w:tc>
         <w:tc>
           <w:tcPr>
-            <w:tcW w:type="dxa" w:w="2556"/>
-            <w:vAlign w:val="top"/>
+            <w:tcW w:type="dxa" w:w="2520"/>
           </w:tcPr>
           <w:p>
             <w:r>
-              <w:rPr>
-                <w:rFonts w:ascii="Calibri" w:hAnsi="Calibri"/>
-                <w:sz w:val="20"/>
-              </w:rPr>
-            </w:r>
-            <w:r>
-              <w:rPr>
-                <w:rFonts w:ascii="Calibri" w:hAnsi="Calibri"/>
-                <w:b w:val="0"/>
-                <w:sz w:val="20"/>
-              </w:rPr>
-              <w:t>Keep _headers in the repository and deployed build.</w:t>
-            </w:r>
-          </w:p>
-        </w:tc>
-      </w:tr>
-      <w:tr>
-        <w:tc>
-          <w:tcPr>
-            <w:tcW w:type="dxa" w:w="2556"/>
-            <w:vAlign w:val="top"/>
-          </w:tcPr>
-          <w:p>
-            <w:r>
-              <w:rPr>
-                <w:rFonts w:ascii="Calibri" w:hAnsi="Calibri"/>
-                <w:sz w:val="20"/>
-              </w:rPr>
-            </w:r>
-            <w:r>
-              <w:rPr>
-                <w:rFonts w:ascii="Calibri" w:hAnsi="Calibri"/>
-                <w:b w:val="0"/>
-                <w:sz w:val="20"/>
-              </w:rPr>
-              <w:t>MIME sniffing</w:t>
-            </w:r>
-          </w:p>
-        </w:tc>
-        <w:tc>
-          <w:tcPr>
-            <w:tcW w:type="dxa" w:w="2556"/>
-            <w:vAlign w:val="top"/>
-          </w:tcPr>
-          <w:p>
-            <w:r>
-              <w:rPr>
-                <w:rFonts w:ascii="Calibri" w:hAnsi="Calibri"/>
-                <w:sz w:val="20"/>
-              </w:rPr>
-            </w:r>
-            <w:r>
-              <w:rPr>
-                <w:rFonts w:ascii="Calibri" w:hAnsi="Calibri"/>
-                <w:b w:val="0"/>
-                <w:sz w:val="20"/>
-              </w:rPr>
-              <w:t>Low</w:t>
-            </w:r>
-          </w:p>
-        </w:tc>
-        <w:tc>
-          <w:tcPr>
-            <w:tcW w:type="dxa" w:w="2556"/>
-            <w:vAlign w:val="top"/>
-          </w:tcPr>
-          <w:p>
-            <w:r>
-              <w:rPr>
-                <w:rFonts w:ascii="Calibri" w:hAnsi="Calibri"/>
-                <w:sz w:val="20"/>
-              </w:rPr>
-            </w:r>
-            <w:r>
-              <w:rPr>
-                <w:rFonts w:ascii="Calibri" w:hAnsi="Calibri"/>
-                <w:b w:val="0"/>
-                <w:sz w:val="20"/>
-              </w:rPr>
-              <w:t>X-Content-Type-Options: nosniff is present.</w:t>
-            </w:r>
-          </w:p>
-        </w:tc>
-        <w:tc>
-          <w:tcPr>
-            <w:tcW w:type="dxa" w:w="2556"/>
-            <w:vAlign w:val="top"/>
-          </w:tcPr>
-          <w:p>
-            <w:r>
-              <w:rPr>
-                <w:rFonts w:ascii="Calibri" w:hAnsi="Calibri"/>
-                <w:sz w:val="20"/>
-              </w:rPr>
-            </w:r>
-            <w:r>
-              <w:rPr>
-                <w:rFonts w:ascii="Calibri" w:hAnsi="Calibri"/>
-                <w:b w:val="0"/>
-                <w:sz w:val="20"/>
-              </w:rPr>
               <w:t>Keep _headers in the deployed project.</w:t>
             </w:r>
           </w:p>
@@ -1587,89 +917,41 @@
       <w:tr>
         <w:tc>
           <w:tcPr>
-            <w:tcW w:type="dxa" w:w="2556"/>
-            <w:vAlign w:val="top"/>
+            <w:tcW w:type="dxa" w:w="2520"/>
           </w:tcPr>
           <w:p>
             <w:r>
-              <w:rPr>
-                <w:rFonts w:ascii="Calibri" w:hAnsi="Calibri"/>
-                <w:sz w:val="20"/>
-              </w:rPr>
-            </w:r>
-            <w:r>
-              <w:rPr>
-                <w:rFonts w:ascii="Calibri" w:hAnsi="Calibri"/>
-                <w:b w:val="0"/>
-                <w:sz w:val="20"/>
-              </w:rPr>
-              <w:t>Data privacy</w:t>
+              <w:t>MIME sniffing</w:t>
             </w:r>
           </w:p>
         </w:tc>
         <w:tc>
           <w:tcPr>
-            <w:tcW w:type="dxa" w:w="2556"/>
-            <w:vAlign w:val="top"/>
+            <w:tcW w:type="dxa" w:w="2520"/>
           </w:tcPr>
           <w:p>
             <w:r>
-              <w:rPr>
-                <w:rFonts w:ascii="Calibri" w:hAnsi="Calibri"/>
-                <w:sz w:val="20"/>
-              </w:rPr>
-            </w:r>
-            <w:r>
-              <w:rPr>
-                <w:rFonts w:ascii="Calibri" w:hAnsi="Calibri"/>
-                <w:b w:val="0"/>
-                <w:sz w:val="20"/>
-              </w:rPr>
               <w:t>Low</w:t>
             </w:r>
           </w:p>
         </w:tc>
         <w:tc>
           <w:tcPr>
-            <w:tcW w:type="dxa" w:w="2556"/>
-            <w:vAlign w:val="top"/>
+            <w:tcW w:type="dxa" w:w="2520"/>
           </w:tcPr>
           <w:p>
             <w:r>
-              <w:rPr>
-                <w:rFonts w:ascii="Calibri" w:hAnsi="Calibri"/>
-                <w:sz w:val="20"/>
-              </w:rPr>
-            </w:r>
-            <w:r>
-              <w:rPr>
-                <w:rFonts w:ascii="Calibri" w:hAnsi="Calibri"/>
-                <w:b w:val="0"/>
-                <w:sz w:val="20"/>
-              </w:rPr>
-              <w:t>The site does not collect or store user data.</w:t>
+              <w:t>X-Content-Type-Options: nosniff should remain present.</w:t>
             </w:r>
           </w:p>
         </w:tc>
         <w:tc>
           <w:tcPr>
-            <w:tcW w:type="dxa" w:w="2556"/>
-            <w:vAlign w:val="top"/>
+            <w:tcW w:type="dxa" w:w="2520"/>
           </w:tcPr>
           <w:p>
             <w:r>
-              <w:rPr>
-                <w:rFonts w:ascii="Calibri" w:hAnsi="Calibri"/>
-                <w:sz w:val="20"/>
-              </w:rPr>
-            </w:r>
-            <w:r>
-              <w:rPr>
-                <w:rFonts w:ascii="Calibri" w:hAnsi="Calibri"/>
-                <w:b w:val="0"/>
-                <w:sz w:val="20"/>
-              </w:rPr>
-              <w:t>Do not add forms, analytics, or tracking without review.</w:t>
+              <w:t>Keep _headers in the deployed project.</w:t>
             </w:r>
           </w:p>
         </w:tc>
@@ -1677,89 +959,41 @@
       <w:tr>
         <w:tc>
           <w:tcPr>
-            <w:tcW w:type="dxa" w:w="2556"/>
-            <w:vAlign w:val="top"/>
+            <w:tcW w:type="dxa" w:w="2520"/>
           </w:tcPr>
           <w:p>
             <w:r>
-              <w:rPr>
-                <w:rFonts w:ascii="Calibri" w:hAnsi="Calibri"/>
-                <w:sz w:val="20"/>
-              </w:rPr>
-            </w:r>
-            <w:r>
-              <w:rPr>
-                <w:rFonts w:ascii="Calibri" w:hAnsi="Calibri"/>
-                <w:b w:val="0"/>
-                <w:sz w:val="20"/>
-              </w:rPr>
-              <w:t>YouTube unlisted videos</w:t>
+              <w:t>Data privacy</w:t>
             </w:r>
           </w:p>
         </w:tc>
         <w:tc>
           <w:tcPr>
-            <w:tcW w:type="dxa" w:w="2556"/>
-            <w:vAlign w:val="top"/>
+            <w:tcW w:type="dxa" w:w="2520"/>
           </w:tcPr>
           <w:p>
             <w:r>
-              <w:rPr>
-                <w:rFonts w:ascii="Calibri" w:hAnsi="Calibri"/>
-                <w:sz w:val="20"/>
-              </w:rPr>
-            </w:r>
-            <w:r>
-              <w:rPr>
-                <w:rFonts w:ascii="Calibri" w:hAnsi="Calibri"/>
-                <w:b w:val="0"/>
-                <w:sz w:val="20"/>
-              </w:rPr>
-              <w:t>Medium</w:t>
+              <w:t>Low</w:t>
             </w:r>
           </w:p>
         </w:tc>
         <w:tc>
           <w:tcPr>
-            <w:tcW w:type="dxa" w:w="2556"/>
-            <w:vAlign w:val="top"/>
+            <w:tcW w:type="dxa" w:w="2520"/>
           </w:tcPr>
           <w:p>
             <w:r>
-              <w:rPr>
-                <w:rFonts w:ascii="Calibri" w:hAnsi="Calibri"/>
-                <w:sz w:val="20"/>
-              </w:rPr>
-            </w:r>
-            <w:r>
-              <w:rPr>
-                <w:rFonts w:ascii="Calibri" w:hAnsi="Calibri"/>
-                <w:b w:val="0"/>
-                <w:sz w:val="20"/>
-              </w:rPr>
-              <w:t>Unlisted videos can be viewed by anyone with the link.</w:t>
+              <w:t>The site does not collect or store user data.</w:t>
             </w:r>
           </w:p>
         </w:tc>
         <w:tc>
           <w:tcPr>
-            <w:tcW w:type="dxa" w:w="2556"/>
-            <w:vAlign w:val="top"/>
+            <w:tcW w:type="dxa" w:w="2520"/>
           </w:tcPr>
           <w:p>
             <w:r>
-              <w:rPr>
-                <w:rFonts w:ascii="Calibri" w:hAnsi="Calibri"/>
-                <w:sz w:val="20"/>
-              </w:rPr>
-            </w:r>
-            <w:r>
-              <w:rPr>
-                <w:rFonts w:ascii="Calibri" w:hAnsi="Calibri"/>
-                <w:b w:val="0"/>
-                <w:sz w:val="20"/>
-              </w:rPr>
-              <w:t>Use unlisted links only if this is acceptable for class use; avoid public playlists.</w:t>
+              <w:t>Do not add forms, analytics, or tracking without another review.</w:t>
             </w:r>
           </w:p>
         </w:tc>
@@ -1767,89 +1001,41 @@
       <w:tr>
         <w:tc>
           <w:tcPr>
-            <w:tcW w:type="dxa" w:w="2556"/>
-            <w:vAlign w:val="top"/>
+            <w:tcW w:type="dxa" w:w="2520"/>
           </w:tcPr>
           <w:p>
             <w:r>
-              <w:rPr>
-                <w:rFonts w:ascii="Calibri" w:hAnsi="Calibri"/>
-                <w:sz w:val="20"/>
-              </w:rPr>
-            </w:r>
-            <w:r>
-              <w:rPr>
-                <w:rFonts w:ascii="Calibri" w:hAnsi="Calibri"/>
-                <w:b w:val="0"/>
-                <w:sz w:val="20"/>
-              </w:rPr>
-              <w:t>Client-side quiz tampering</w:t>
+              <w:t>YouTube unlisted videos</w:t>
             </w:r>
           </w:p>
         </w:tc>
         <w:tc>
           <w:tcPr>
-            <w:tcW w:type="dxa" w:w="2556"/>
-            <w:vAlign w:val="top"/>
+            <w:tcW w:type="dxa" w:w="2520"/>
           </w:tcPr>
           <w:p>
             <w:r>
-              <w:rPr>
-                <w:rFonts w:ascii="Calibri" w:hAnsi="Calibri"/>
-                <w:sz w:val="20"/>
-              </w:rPr>
-            </w:r>
-            <w:r>
-              <w:rPr>
-                <w:rFonts w:ascii="Calibri" w:hAnsi="Calibri"/>
-                <w:b w:val="0"/>
-                <w:sz w:val="20"/>
-              </w:rPr>
               <w:t>Medium</w:t>
             </w:r>
           </w:p>
         </w:tc>
         <w:tc>
           <w:tcPr>
-            <w:tcW w:type="dxa" w:w="2556"/>
-            <w:vAlign w:val="top"/>
+            <w:tcW w:type="dxa" w:w="2520"/>
           </w:tcPr>
           <w:p>
             <w:r>
-              <w:rPr>
-                <w:rFonts w:ascii="Calibri" w:hAnsi="Calibri"/>
-                <w:sz w:val="20"/>
-              </w:rPr>
-            </w:r>
-            <w:r>
-              <w:rPr>
-                <w:rFonts w:ascii="Calibri" w:hAnsi="Calibri"/>
-                <w:b w:val="0"/>
-                <w:sz w:val="20"/>
-              </w:rPr>
-              <w:t>A technical user could manipulate their local browser because the quiz is client-side.</w:t>
+              <w:t>Unlisted videos can be viewed by anyone with the link.</w:t>
             </w:r>
           </w:p>
         </w:tc>
         <w:tc>
           <w:tcPr>
-            <w:tcW w:type="dxa" w:w="2556"/>
-            <w:vAlign w:val="top"/>
+            <w:tcW w:type="dxa" w:w="2520"/>
           </w:tcPr>
           <w:p>
             <w:r>
-              <w:rPr>
-                <w:rFonts w:ascii="Calibri" w:hAnsi="Calibri"/>
-                <w:sz w:val="20"/>
-              </w:rPr>
-            </w:r>
-            <w:r>
-              <w:rPr>
-                <w:rFonts w:ascii="Calibri" w:hAnsi="Calibri"/>
-                <w:b w:val="0"/>
-                <w:sz w:val="20"/>
-              </w:rPr>
-              <w:t>Treat the badge as a learning check, not as an official verified credential.</w:t>
+              <w:t>Use unlisted links only if acceptable for class use.</w:t>
             </w:r>
           </w:p>
         </w:tc>
@@ -1857,89 +1043,41 @@
       <w:tr>
         <w:tc>
           <w:tcPr>
-            <w:tcW w:type="dxa" w:w="2556"/>
-            <w:vAlign w:val="top"/>
+            <w:tcW w:type="dxa" w:w="2520"/>
           </w:tcPr>
           <w:p>
             <w:r>
-              <w:rPr>
-                <w:rFonts w:ascii="Calibri" w:hAnsi="Calibri"/>
-                <w:sz w:val="20"/>
-              </w:rPr>
-            </w:r>
-            <w:r>
-              <w:rPr>
-                <w:rFonts w:ascii="Calibri" w:hAnsi="Calibri"/>
-                <w:b w:val="0"/>
-                <w:sz w:val="20"/>
-              </w:rPr>
-              <w:t>Transcript accuracy</w:t>
+              <w:t>Client-side quiz tampering</w:t>
             </w:r>
           </w:p>
         </w:tc>
         <w:tc>
           <w:tcPr>
-            <w:tcW w:type="dxa" w:w="2556"/>
-            <w:vAlign w:val="top"/>
+            <w:tcW w:type="dxa" w:w="2520"/>
           </w:tcPr>
           <w:p>
             <w:r>
-              <w:rPr>
-                <w:rFonts w:ascii="Calibri" w:hAnsi="Calibri"/>
-                <w:sz w:val="20"/>
-              </w:rPr>
-            </w:r>
-            <w:r>
-              <w:rPr>
-                <w:rFonts w:ascii="Calibri" w:hAnsi="Calibri"/>
-                <w:b w:val="0"/>
-                <w:sz w:val="20"/>
-              </w:rPr>
               <w:t>Medium</w:t>
             </w:r>
           </w:p>
         </w:tc>
         <w:tc>
           <w:tcPr>
-            <w:tcW w:type="dxa" w:w="2556"/>
-            <w:vAlign w:val="top"/>
+            <w:tcW w:type="dxa" w:w="2520"/>
           </w:tcPr>
           <w:p>
             <w:r>
-              <w:rPr>
-                <w:rFonts w:ascii="Calibri" w:hAnsi="Calibri"/>
-                <w:sz w:val="20"/>
-              </w:rPr>
-            </w:r>
-            <w:r>
-              <w:rPr>
-                <w:rFonts w:ascii="Calibri" w:hAnsi="Calibri"/>
-                <w:b w:val="0"/>
-                <w:sz w:val="20"/>
-              </w:rPr>
-              <w:t>Transcripts are auto-generated and lightly cleaned.</w:t>
+              <w:t>A technical user could manipulate their local browser because the quiz is client-side.</w:t>
             </w:r>
           </w:p>
         </w:tc>
         <w:tc>
           <w:tcPr>
-            <w:tcW w:type="dxa" w:w="2556"/>
-            <w:vAlign w:val="top"/>
+            <w:tcW w:type="dxa" w:w="2520"/>
           </w:tcPr>
           <w:p>
             <w:r>
-              <w:rPr>
-                <w:rFonts w:ascii="Calibri" w:hAnsi="Calibri"/>
-                <w:sz w:val="20"/>
-              </w:rPr>
-            </w:r>
-            <w:r>
-              <w:rPr>
-                <w:rFonts w:ascii="Calibri" w:hAnsi="Calibri"/>
-                <w:b w:val="0"/>
-                <w:sz w:val="20"/>
-              </w:rPr>
-              <w:t>Use transcripts as accessibility support; perform human review before treating them as official verbatim records.</w:t>
+              <w:t>Treat the badge as a learning check, not an official verified credential.</w:t>
             </w:r>
           </w:p>
         </w:tc>
@@ -1947,88 +1085,82 @@
       <w:tr>
         <w:tc>
           <w:tcPr>
-            <w:tcW w:type="dxa" w:w="2556"/>
-            <w:vAlign w:val="top"/>
+            <w:tcW w:type="dxa" w:w="2520"/>
           </w:tcPr>
           <w:p>
             <w:r>
-              <w:rPr>
-                <w:rFonts w:ascii="Calibri" w:hAnsi="Calibri"/>
-                <w:sz w:val="20"/>
-              </w:rPr>
+              <w:t>Transcript accuracy</w:t>
             </w:r>
+          </w:p>
+        </w:tc>
+        <w:tc>
+          <w:tcPr>
+            <w:tcW w:type="dxa" w:w="2520"/>
+          </w:tcPr>
+          <w:p>
             <w:r>
-              <w:rPr>
-                <w:rFonts w:ascii="Calibri" w:hAnsi="Calibri"/>
-                <w:b w:val="0"/>
-                <w:sz w:val="20"/>
-              </w:rPr>
+              <w:t>Medium</w:t>
+            </w:r>
+          </w:p>
+        </w:tc>
+        <w:tc>
+          <w:tcPr>
+            <w:tcW w:type="dxa" w:w="2520"/>
+          </w:tcPr>
+          <w:p>
+            <w:r>
+              <w:t>Transcripts are auto-generated and lightly cleaned.</w:t>
+            </w:r>
+          </w:p>
+        </w:tc>
+        <w:tc>
+          <w:tcPr>
+            <w:tcW w:type="dxa" w:w="2520"/>
+          </w:tcPr>
+          <w:p>
+            <w:r>
+              <w:t>Use transcripts as accessibility support; human review is recommended.</w:t>
+            </w:r>
+          </w:p>
+        </w:tc>
+      </w:tr>
+      <w:tr>
+        <w:tc>
+          <w:tcPr>
+            <w:tcW w:type="dxa" w:w="2520"/>
+          </w:tcPr>
+          <w:p>
+            <w:r>
               <w:t>Repository access</w:t>
             </w:r>
           </w:p>
         </w:tc>
         <w:tc>
           <w:tcPr>
-            <w:tcW w:type="dxa" w:w="2556"/>
-            <w:vAlign w:val="top"/>
+            <w:tcW w:type="dxa" w:w="2520"/>
           </w:tcPr>
           <w:p>
             <w:r>
-              <w:rPr>
-                <w:rFonts w:ascii="Calibri" w:hAnsi="Calibri"/>
-                <w:sz w:val="20"/>
-              </w:rPr>
-            </w:r>
-            <w:r>
-              <w:rPr>
-                <w:rFonts w:ascii="Calibri" w:hAnsi="Calibri"/>
-                <w:b w:val="0"/>
-                <w:sz w:val="20"/>
-              </w:rPr>
               <w:t>Medium</w:t>
             </w:r>
           </w:p>
         </w:tc>
         <w:tc>
           <w:tcPr>
-            <w:tcW w:type="dxa" w:w="2556"/>
-            <w:vAlign w:val="top"/>
+            <w:tcW w:type="dxa" w:w="2520"/>
           </w:tcPr>
           <w:p>
             <w:r>
-              <w:rPr>
-                <w:rFonts w:ascii="Calibri" w:hAnsi="Calibri"/>
-                <w:sz w:val="20"/>
-              </w:rPr>
-            </w:r>
-            <w:r>
-              <w:rPr>
-                <w:rFonts w:ascii="Calibri" w:hAnsi="Calibri"/>
-                <w:b w:val="0"/>
-                <w:sz w:val="20"/>
-              </w:rPr>
               <w:t>Anyone with write access could push unwanted changes.</w:t>
             </w:r>
           </w:p>
         </w:tc>
         <w:tc>
           <w:tcPr>
-            <w:tcW w:type="dxa" w:w="2556"/>
-            <w:vAlign w:val="top"/>
+            <w:tcW w:type="dxa" w:w="2520"/>
           </w:tcPr>
           <w:p>
             <w:r>
-              <w:rPr>
-                <w:rFonts w:ascii="Calibri" w:hAnsi="Calibri"/>
-                <w:sz w:val="20"/>
-              </w:rPr>
-            </w:r>
-            <w:r>
-              <w:rPr>
-                <w:rFonts w:ascii="Calibri" w:hAnsi="Calibri"/>
-                <w:b w:val="0"/>
-                <w:sz w:val="20"/>
-              </w:rPr>
               <w:t>Limit collaborators, use GitHub 2FA, and review changes before deployment.</w:t>
             </w:r>
           </w:p>
@@ -2044,13 +1176,11 @@
       </w:r>
     </w:p>
     <w:p>
+      <w:pPr>
+        <w:spacing w:after="120"/>
+      </w:pPr>
       <w:r>
         <w:t>The content is appropriate for a student-facing AI ethics toolkit. It uses careful wording and does not present AI as perfect or as a replacement for human judgment. The major themes are responsible AI use, syllabus/instructor expectations, source verification, privacy, data security, career readiness, human connection, environmental awareness, and academic integrity.</w:t>
-      </w:r>
-    </w:p>
-    <w:p>
-      <w:r>
-        <w:t>Content reliability findings:</w:t>
       </w:r>
     </w:p>
     <w:p>
@@ -2074,7 +1204,7 @@
         <w:pStyle w:val="ListBullet"/>
       </w:pPr>
       <w:r>
-        <w:t>The site correctly frames AI as a support tool rather than a substitute for learning or judgment.</w:t>
+        <w:t>The site frames AI as a support tool rather than a substitute for learning or judgment.</w:t>
       </w:r>
     </w:p>
     <w:p>
@@ -2082,7 +1212,7 @@
         <w:pStyle w:val="ListBullet"/>
       </w:pPr>
       <w:r>
-        <w:t>The site warns students not to paste sensitive personal, financial, medical, or identifying information into AI tools.</w:t>
+        <w:t>The site warns students not to share sensitive personal, financial, medical, identifying, or confidential information with AI tools.</w:t>
       </w:r>
     </w:p>
     <w:p>
@@ -2098,10 +1228,13 @@
         <w:pStyle w:val="ListBullet"/>
       </w:pPr>
       <w:r>
-        <w:t>Interview transcripts and videos provide campus-specific perspectives that support the toolkit’s student-facing purpose.</w:t>
+        <w:t>Interview transcripts and videos provide campus-specific perspectives that support the toolkit's student-facing purpose.</w:t>
       </w:r>
     </w:p>
     <w:p>
+      <w:pPr>
+        <w:spacing w:after="120"/>
+      </w:pPr>
       <w:r>
         <w:t>Final note: the toolkit should be presented as an educational class resource unless St. Ambrose University formally approves it as official university policy.</w:t>
       </w:r>
@@ -2112,11 +1245,6 @@
       </w:pPr>
       <w:r>
         <w:t>8. Deployment Readiness</w:t>
-      </w:r>
-    </w:p>
-    <w:p>
-      <w:r>
-        <w:t>Deployment-readiness status:</w:t>
       </w:r>
     </w:p>
     <w:p>
@@ -2132,7 +1260,7 @@
         <w:pStyle w:val="ListBullet"/>
       </w:pPr>
       <w:r>
-        <w:t>Ready for final class review.</w:t>
+        <w:t>Ready for final group/class review.</w:t>
       </w:r>
     </w:p>
     <w:p>
@@ -2156,7 +1284,7 @@
         <w:pStyle w:val="ListBullet"/>
       </w:pPr>
       <w:r>
-        <w:t>Nmap/domain-level review was separately performed by the developer and did not identify a site-level issue according to the developer’s report.</w:t>
+        <w:t>Domain-level review was separately performed by the developer and did not identify a site-level issue according to the developer's report.</w:t>
       </w:r>
     </w:p>
     <w:p>
@@ -2164,7 +1292,7 @@
         <w:pStyle w:val="Heading1"/>
       </w:pPr>
       <w:r>
-        <w:t>9. Recommendations Before and After Final Push</w:t>
+        <w:t>9. Recommendations Before Final Presentation</w:t>
       </w:r>
     </w:p>
     <w:p>
@@ -2248,8 +1376,11 @@
       </w:r>
     </w:p>
     <w:p>
+      <w:pPr>
+        <w:spacing w:after="120"/>
+      </w:pPr>
       <w:r>
-        <w:t>The SAU AI Ethics Toolkit is secure enough, credible enough, and polished enough for class-project deployment and final class review. The site is not a formal policy system and should not be treated as a tamper-proof credentialing platform, but it is appropriate as a student-facing educational resource.</w:t>
+        <w:t>The SAU AI Ethics Toolkit is secure enough, credible enough, and polished enough for class-project deployment and final group/class review. The site is not a formal policy system and should not be treated as a tamper-proof credentialing platform, but it is appropriate as a student-facing educational resource.</w:t>
       </w:r>
     </w:p>
     <w:tbl>
@@ -2259,54 +1390,26 @@
         <w:tblLook w:firstColumn="1" w:firstRow="1" w:lastColumn="0" w:lastRow="0" w:noHBand="0" w:noVBand="1" w:val="04A0"/>
       </w:tblPr>
       <w:tblGrid>
-        <w:gridCol w:w="5112"/>
-        <w:gridCol w:w="5112"/>
+        <w:gridCol w:w="5040"/>
+        <w:gridCol w:w="5040"/>
       </w:tblGrid>
       <w:tr>
         <w:tc>
           <w:tcPr>
-            <w:tcW w:type="dxa" w:w="5112"/>
-            <w:vAlign w:val="top"/>
-            <w:shd w:fill="003087"/>
+            <w:tcW w:type="dxa" w:w="5040"/>
           </w:tcPr>
           <w:p>
             <w:r>
-              <w:rPr>
-                <w:rFonts w:ascii="Calibri" w:hAnsi="Calibri"/>
-                <w:sz w:val="20"/>
-              </w:rPr>
-            </w:r>
-            <w:r>
-              <w:rPr>
-                <w:rFonts w:ascii="Calibri" w:hAnsi="Calibri"/>
-                <w:b/>
-                <w:color w:val="FFFFFF"/>
-                <w:sz w:val="20"/>
-              </w:rPr>
               <w:t>Category</w:t>
             </w:r>
           </w:p>
         </w:tc>
         <w:tc>
           <w:tcPr>
-            <w:tcW w:type="dxa" w:w="5112"/>
-            <w:vAlign w:val="top"/>
-            <w:shd w:fill="003087"/>
+            <w:tcW w:type="dxa" w:w="5040"/>
           </w:tcPr>
           <w:p>
             <w:r>
-              <w:rPr>
-                <w:rFonts w:ascii="Calibri" w:hAnsi="Calibri"/>
-                <w:sz w:val="20"/>
-              </w:rPr>
-            </w:r>
-            <w:r>
-              <w:rPr>
-                <w:rFonts w:ascii="Calibri" w:hAnsi="Calibri"/>
-                <w:b/>
-                <w:color w:val="FFFFFF"/>
-                <w:sz w:val="20"/>
-              </w:rPr>
               <w:t>Verdict</w:t>
             </w:r>
           </w:p>
@@ -2315,44 +1418,20 @@
       <w:tr>
         <w:tc>
           <w:tcPr>
-            <w:tcW w:type="dxa" w:w="5112"/>
-            <w:vAlign w:val="top"/>
+            <w:tcW w:type="dxa" w:w="5040"/>
           </w:tcPr>
           <w:p>
             <w:r>
-              <w:rPr>
-                <w:rFonts w:ascii="Calibri" w:hAnsi="Calibri"/>
-                <w:sz w:val="20"/>
-              </w:rPr>
-            </w:r>
-            <w:r>
-              <w:rPr>
-                <w:rFonts w:ascii="Calibri" w:hAnsi="Calibri"/>
-                <w:b w:val="0"/>
-                <w:sz w:val="20"/>
-              </w:rPr>
               <w:t>Security</w:t>
             </w:r>
           </w:p>
         </w:tc>
         <w:tc>
           <w:tcPr>
-            <w:tcW w:type="dxa" w:w="5112"/>
-            <w:vAlign w:val="top"/>
+            <w:tcW w:type="dxa" w:w="5040"/>
           </w:tcPr>
           <w:p>
             <w:r>
-              <w:rPr>
-                <w:rFonts w:ascii="Calibri" w:hAnsi="Calibri"/>
-                <w:sz w:val="20"/>
-              </w:rPr>
-            </w:r>
-            <w:r>
-              <w:rPr>
-                <w:rFonts w:ascii="Calibri" w:hAnsi="Calibri"/>
-                <w:b w:val="0"/>
-                <w:sz w:val="20"/>
-              </w:rPr>
               <w:t>Good for deployment as a static educational site</w:t>
             </w:r>
           </w:p>
@@ -2361,45 +1440,21 @@
       <w:tr>
         <w:tc>
           <w:tcPr>
-            <w:tcW w:type="dxa" w:w="5112"/>
-            <w:vAlign w:val="top"/>
+            <w:tcW w:type="dxa" w:w="5040"/>
           </w:tcPr>
           <w:p>
             <w:r>
-              <w:rPr>
-                <w:rFonts w:ascii="Calibri" w:hAnsi="Calibri"/>
-                <w:sz w:val="20"/>
-              </w:rPr>
-            </w:r>
-            <w:r>
-              <w:rPr>
-                <w:rFonts w:ascii="Calibri" w:hAnsi="Calibri"/>
-                <w:b w:val="0"/>
-                <w:sz w:val="20"/>
-              </w:rPr>
               <w:t>Content credibility</w:t>
             </w:r>
           </w:p>
         </w:tc>
         <w:tc>
           <w:tcPr>
-            <w:tcW w:type="dxa" w:w="5112"/>
-            <w:vAlign w:val="top"/>
+            <w:tcW w:type="dxa" w:w="5040"/>
           </w:tcPr>
           <w:p>
             <w:r>
-              <w:rPr>
-                <w:rFonts w:ascii="Calibri" w:hAnsi="Calibri"/>
-                <w:sz w:val="20"/>
-              </w:rPr>
-            </w:r>
-            <w:r>
-              <w:rPr>
-                <w:rFonts w:ascii="Calibri" w:hAnsi="Calibri"/>
-                <w:b w:val="0"/>
-                <w:sz w:val="20"/>
-              </w:rPr>
-              <w:t>Good for student-facing class resource</w:t>
+              <w:t>Good for a student-facing class resource</w:t>
             </w:r>
           </w:p>
         </w:tc>
@@ -2407,44 +1462,20 @@
       <w:tr>
         <w:tc>
           <w:tcPr>
-            <w:tcW w:type="dxa" w:w="5112"/>
-            <w:vAlign w:val="top"/>
+            <w:tcW w:type="dxa" w:w="5040"/>
           </w:tcPr>
           <w:p>
             <w:r>
-              <w:rPr>
-                <w:rFonts w:ascii="Calibri" w:hAnsi="Calibri"/>
-                <w:sz w:val="20"/>
-              </w:rPr>
-            </w:r>
-            <w:r>
-              <w:rPr>
-                <w:rFonts w:ascii="Calibri" w:hAnsi="Calibri"/>
-                <w:b w:val="0"/>
-                <w:sz w:val="20"/>
-              </w:rPr>
               <w:t>Bibliography connection</w:t>
             </w:r>
           </w:p>
         </w:tc>
         <w:tc>
           <w:tcPr>
-            <w:tcW w:type="dxa" w:w="5112"/>
-            <w:vAlign w:val="top"/>
+            <w:tcW w:type="dxa" w:w="5040"/>
           </w:tcPr>
           <w:p>
             <w:r>
-              <w:rPr>
-                <w:rFonts w:ascii="Calibri" w:hAnsi="Calibri"/>
-                <w:sz w:val="20"/>
-              </w:rPr>
-            </w:r>
-            <w:r>
-              <w:rPr>
-                <w:rFonts w:ascii="Calibri" w:hAnsi="Calibri"/>
-                <w:b w:val="0"/>
-                <w:sz w:val="20"/>
-              </w:rPr>
               <w:t>Good; sources are grouped and aligned to site topics</w:t>
             </w:r>
           </w:p>
@@ -2453,44 +1484,20 @@
       <w:tr>
         <w:tc>
           <w:tcPr>
-            <w:tcW w:type="dxa" w:w="5112"/>
-            <w:vAlign w:val="top"/>
+            <w:tcW w:type="dxa" w:w="5040"/>
           </w:tcPr>
           <w:p>
             <w:r>
-              <w:rPr>
-                <w:rFonts w:ascii="Calibri" w:hAnsi="Calibri"/>
-                <w:sz w:val="20"/>
-              </w:rPr>
-            </w:r>
-            <w:r>
-              <w:rPr>
-                <w:rFonts w:ascii="Calibri" w:hAnsi="Calibri"/>
-                <w:b w:val="0"/>
-                <w:sz w:val="20"/>
-              </w:rPr>
               <w:t>Quiz/badge workflow</w:t>
             </w:r>
           </w:p>
         </w:tc>
         <w:tc>
           <w:tcPr>
-            <w:tcW w:type="dxa" w:w="5112"/>
-            <w:vAlign w:val="top"/>
+            <w:tcW w:type="dxa" w:w="5040"/>
           </w:tcPr>
           <w:p>
             <w:r>
-              <w:rPr>
-                <w:rFonts w:ascii="Calibri" w:hAnsi="Calibri"/>
-                <w:sz w:val="20"/>
-              </w:rPr>
-            </w:r>
-            <w:r>
-              <w:rPr>
-                <w:rFonts w:ascii="Calibri" w:hAnsi="Calibri"/>
-                <w:b w:val="0"/>
-                <w:sz w:val="20"/>
-              </w:rPr>
               <w:t>Functional as a learning check; not an official verified credential</w:t>
             </w:r>
           </w:p>
@@ -2499,44 +1506,20 @@
       <w:tr>
         <w:tc>
           <w:tcPr>
-            <w:tcW w:type="dxa" w:w="5112"/>
-            <w:vAlign w:val="top"/>
+            <w:tcW w:type="dxa" w:w="5040"/>
           </w:tcPr>
           <w:p>
             <w:r>
-              <w:rPr>
-                <w:rFonts w:ascii="Calibri" w:hAnsi="Calibri"/>
-                <w:sz w:val="20"/>
-              </w:rPr>
-            </w:r>
-            <w:r>
-              <w:rPr>
-                <w:rFonts w:ascii="Calibri" w:hAnsi="Calibri"/>
-                <w:b w:val="0"/>
-                <w:sz w:val="20"/>
-              </w:rPr>
               <w:t>Interviews/transcripts</w:t>
             </w:r>
           </w:p>
         </w:tc>
         <w:tc>
           <w:tcPr>
-            <w:tcW w:type="dxa" w:w="5112"/>
-            <w:vAlign w:val="top"/>
+            <w:tcW w:type="dxa" w:w="5040"/>
           </w:tcPr>
           <w:p>
             <w:r>
-              <w:rPr>
-                <w:rFonts w:ascii="Calibri" w:hAnsi="Calibri"/>
-                <w:sz w:val="20"/>
-              </w:rPr>
-            </w:r>
-            <w:r>
-              <w:rPr>
-                <w:rFonts w:ascii="Calibri" w:hAnsi="Calibri"/>
-                <w:b w:val="0"/>
-                <w:sz w:val="20"/>
-              </w:rPr>
               <w:t>Included; transcripts are accessibility support and should be treated as lightly cleaned auto-generated text</w:t>
             </w:r>
           </w:p>
@@ -2545,76 +1528,45 @@
       <w:tr>
         <w:tc>
           <w:tcPr>
-            <w:tcW w:type="dxa" w:w="5112"/>
-            <w:vAlign w:val="top"/>
+            <w:tcW w:type="dxa" w:w="5040"/>
           </w:tcPr>
           <w:p>
             <w:r>
-              <w:rPr>
-                <w:rFonts w:ascii="Calibri" w:hAnsi="Calibri"/>
-                <w:sz w:val="20"/>
-              </w:rPr>
-            </w:r>
-            <w:r>
-              <w:rPr>
-                <w:rFonts w:ascii="Calibri" w:hAnsi="Calibri"/>
-                <w:b w:val="0"/>
-                <w:sz w:val="20"/>
-              </w:rPr>
               <w:t>Final status</w:t>
             </w:r>
           </w:p>
         </w:tc>
         <w:tc>
           <w:tcPr>
-            <w:tcW w:type="dxa" w:w="5112"/>
-            <w:vAlign w:val="top"/>
+            <w:tcW w:type="dxa" w:w="5040"/>
           </w:tcPr>
           <w:p>
             <w:r>
-              <w:rPr>
-                <w:rFonts w:ascii="Calibri" w:hAnsi="Calibri"/>
-                <w:sz w:val="20"/>
-              </w:rPr>
-            </w:r>
-            <w:r>
-              <w:rPr>
-                <w:rFonts w:ascii="Calibri" w:hAnsi="Calibri"/>
-                <w:b w:val="0"/>
-                <w:sz w:val="20"/>
-              </w:rPr>
-              <w:t>Ready for final class review and push</w:t>
+              <w:t>Ready for final group/class review and push</w:t>
             </w:r>
           </w:p>
         </w:tc>
       </w:tr>
     </w:tbl>
+    <w:p>
+      <w:pPr>
+        <w:jc w:val="center"/>
+      </w:pPr>
+      <w:r>
+        <w:rPr>
+          <w:i/>
+        </w:rPr>
+        <w:t>SAU AI Ethics Toolkit Security Audit | PHIL 102 | May 2026</w:t>
+      </w:r>
+    </w:p>
     <w:sectPr>
-      <w:footerReference w:type="default" r:id="rId9"/>
       <w:pgSz w:w="12240" w:h="15840"/>
-      <w:pgMar w:top="1008" w:right="1008" w:bottom="1008" w:left="1008" w:header="720" w:footer="720" w:gutter="0"/>
+      <w:pgMar w:top="1008" w:right="1080" w:bottom="1008" w:left="1080" w:header="720" w:footer="720" w:gutter="0"/>
       <w:cols w:space="720"/>
       <w:docGrid w:linePitch="360"/>
     </w:sectPr>
   </w:body>
 </w:document>
-</file>
-
-<file path=word/footer1.xml><?xml version="1.0" encoding="utf-8"?>
-<w:ftr xmlns:m="http://schemas.openxmlformats.org/officeDocument/2006/math" xmlns:mc="http://schemas.openxmlformats.org/markup-compatibility/2006" xmlns:mo="http://schemas.microsoft.com/office/mac/office/2008/main" xmlns:mv="urn:schemas-microsoft-com:mac:vml" xmlns:o="urn:schemas-microsoft-com:office:office" xmlns:r="http://schemas.openxmlformats.org/officeDocument/2006/relationships" xmlns:v="urn:schemas-microsoft-com:vml" xmlns:w10="urn:schemas-microsoft-com:office:word" xmlns:w14="http://schemas.microsoft.com/office/word/2010/wordml" xmlns:w="http://schemas.openxmlformats.org/wordprocessingml/2006/main" xmlns:wne="http://schemas.microsoft.com/office/word/2006/wordml" xmlns:wp14="http://schemas.microsoft.com/office/word/2010/wordprocessingDrawing" xmlns:wp="http://schemas.openxmlformats.org/drawingml/2006/wordprocessingDrawing" xmlns:wpc="http://schemas.microsoft.com/office/word/2010/wordprocessingCanvas" xmlns:wpg="http://schemas.microsoft.com/office/word/2010/wordprocessingGroup" xmlns:wpi="http://schemas.microsoft.com/office/word/2010/wordprocessingInk" xmlns:wps="http://schemas.microsoft.com/office/word/2010/wordprocessingShape" mc:Ignorable="w14 wp14">
-  <w:p>
-    <w:pPr>
-      <w:pStyle w:val="Footer"/>
-      <w:jc w:val="center"/>
-    </w:pPr>
-    <w:r>
-      <w:rPr>
-        <w:sz w:val="18"/>
-      </w:rPr>
-      <w:t>SAU AI Ethics Toolkit Security Audit | PHIL 102 | May 2026</w:t>
-    </w:r>
-  </w:p>
-</w:ftr>
 </file>
 
 <file path=word/numbering.xml><?xml version="1.0" encoding="utf-8"?>
@@ -2981,7 +1933,7 @@
     <w:qFormat/>
     <w:rsid w:val="00FC693F"/>
     <w:rPr>
-      <w:rFonts w:ascii="Calibri" w:hAnsi="Calibri"/>
+      <w:rFonts w:ascii="Aptos" w:hAnsi="Aptos"/>
       <w:sz w:val="21"/>
     </w:rPr>
   </w:style>
@@ -3044,11 +1996,11 @@
       <w:outlineLvl w:val="0"/>
     </w:pPr>
     <w:rPr>
-      <w:rFonts w:asciiTheme="majorHAnsi" w:eastAsiaTheme="majorEastAsia" w:hAnsiTheme="majorHAnsi" w:cstheme="majorBidi" w:ascii="Calibri" w:hAnsi="Calibri"/>
+      <w:rFonts w:asciiTheme="majorHAnsi" w:eastAsiaTheme="majorEastAsia" w:hAnsiTheme="majorHAnsi" w:cstheme="majorBidi" w:ascii="Aptos" w:hAnsi="Aptos"/>
       <w:b/>
       <w:bCs/>
       <w:color w:val="003087"/>
-      <w:sz w:val="32"/>
+      <w:sz w:val="28"/>
       <w:szCs w:val="28"/>
     </w:rPr>
   </w:style>
@@ -3068,7 +2020,7 @@
       <w:outlineLvl w:val="1"/>
     </w:pPr>
     <w:rPr>
-      <w:rFonts w:asciiTheme="majorHAnsi" w:eastAsiaTheme="majorEastAsia" w:hAnsiTheme="majorHAnsi" w:cstheme="majorBidi" w:ascii="Calibri" w:hAnsi="Calibri"/>
+      <w:rFonts w:asciiTheme="majorHAnsi" w:eastAsiaTheme="majorEastAsia" w:hAnsiTheme="majorHAnsi" w:cstheme="majorBidi" w:ascii="Aptos" w:hAnsi="Aptos"/>
       <w:b/>
       <w:bCs/>
       <w:color w:val="003087"/>
@@ -3092,11 +2044,10 @@
       <w:outlineLvl w:val="2"/>
     </w:pPr>
     <w:rPr>
-      <w:rFonts w:asciiTheme="majorHAnsi" w:eastAsiaTheme="majorEastAsia" w:hAnsiTheme="majorHAnsi" w:cstheme="majorBidi" w:ascii="Calibri" w:hAnsi="Calibri"/>
+      <w:rFonts w:asciiTheme="majorHAnsi" w:eastAsiaTheme="majorEastAsia" w:hAnsiTheme="majorHAnsi" w:cstheme="majorBidi" w:ascii="Aptos" w:hAnsi="Aptos"/>
       <w:b/>
       <w:bCs/>
       <w:color w:val="003087"/>
-      <w:sz w:val="23"/>
     </w:rPr>
   </w:style>
   <w:style w:type="paragraph" w:styleId="Heading4">

</xml_diff>